<commit_message>
modif fichier exercice 1
</commit_message>
<xml_diff>
--- a/Notes de cours/03 - exercices/03 - exercice1.docx
+++ b/Notes de cours/03 - exercices/03 - exercice1.docx
@@ -1,6 +1,6 @@
 
 <file path=word/document.xml><?xml version="1.0" encoding="utf-8"?>
-<w:document xmlns:wpc="http://schemas.microsoft.com/office/word/2010/wordprocessingCanvas" xmlns:cx="http://schemas.microsoft.com/office/drawing/2014/chartex" xmlns:cx1="http://schemas.microsoft.com/office/drawing/2015/9/8/chartex" xmlns:cx2="http://schemas.microsoft.com/office/drawing/2015/10/21/chartex" xmlns:cx3="http://schemas.microsoft.com/office/drawing/2016/5/9/chartex" xmlns:cx4="http://schemas.microsoft.com/office/drawing/2016/5/10/chartex" xmlns:cx5="http://schemas.microsoft.com/office/drawing/2016/5/11/chartex" xmlns:cx6="http://schemas.microsoft.com/office/drawing/2016/5/12/chartex" xmlns:cx7="http://schemas.microsoft.com/office/drawing/2016/5/13/chartex" xmlns:cx8="http://schemas.microsoft.com/office/drawing/2016/5/14/chartex" xmlns:mc="http://schemas.openxmlformats.org/markup-compatibility/2006" xmlns:aink="http://schemas.microsoft.com/office/drawing/2016/ink" xmlns:am3d="http://schemas.microsoft.com/office/drawing/2017/model3d" xmlns:o="urn:schemas-microsoft-com:office:office" xmlns:oel="http://schemas.microsoft.com/office/2019/extlst" xmlns:r="http://schemas.openxmlformats.org/officeDocument/2006/relationships" xmlns:m="http://schemas.openxmlformats.org/officeDocument/2006/math" xmlns:v="urn:schemas-microsoft-com:vml" xmlns:wp14="http://schemas.microsoft.com/office/word/2010/wordprocessingDrawing" xmlns:wp="http://schemas.openxmlformats.org/drawingml/2006/wordprocessingDrawing" xmlns:w10="urn:schemas-microsoft-com:office:word" xmlns:w="http://schemas.openxmlformats.org/wordprocessingml/2006/main" xmlns:w14="http://schemas.microsoft.com/office/word/2010/wordml" xmlns:w15="http://schemas.microsoft.com/office/word/2012/wordml" xmlns:w16cex="http://schemas.microsoft.com/office/word/2018/wordml/cex" xmlns:w16cid="http://schemas.microsoft.com/office/word/2016/wordml/cid" xmlns:w16="http://schemas.microsoft.com/office/word/2018/wordml" xmlns:w16du="http://schemas.microsoft.com/office/word/2023/wordml/word16du" xmlns:w16sdtdh="http://schemas.microsoft.com/office/word/2020/wordml/sdtdatahash" xmlns:w16se="http://schemas.microsoft.com/office/word/2015/wordml/symex" xmlns:wpg="http://schemas.microsoft.com/office/word/2010/wordprocessingGroup" xmlns:wpi="http://schemas.microsoft.com/office/word/2010/wordprocessingInk" xmlns:wne="http://schemas.microsoft.com/office/word/2006/wordml" xmlns:wps="http://schemas.microsoft.com/office/word/2010/wordprocessingShape" mc:Ignorable="w14 w15 w16se w16cid w16 w16cex w16sdtdh w16du wp14">
+<w:document xmlns:wpc="http://schemas.microsoft.com/office/word/2010/wordprocessingCanvas" xmlns:cx="http://schemas.microsoft.com/office/drawing/2014/chartex" xmlns:cx1="http://schemas.microsoft.com/office/drawing/2015/9/8/chartex" xmlns:cx2="http://schemas.microsoft.com/office/drawing/2015/10/21/chartex" xmlns:cx3="http://schemas.microsoft.com/office/drawing/2016/5/9/chartex" xmlns:cx4="http://schemas.microsoft.com/office/drawing/2016/5/10/chartex" xmlns:cx5="http://schemas.microsoft.com/office/drawing/2016/5/11/chartex" xmlns:cx6="http://schemas.microsoft.com/office/drawing/2016/5/12/chartex" xmlns:cx7="http://schemas.microsoft.com/office/drawing/2016/5/13/chartex" xmlns:cx8="http://schemas.microsoft.com/office/drawing/2016/5/14/chartex" xmlns:mc="http://schemas.openxmlformats.org/markup-compatibility/2006" xmlns:aink="http://schemas.microsoft.com/office/drawing/2016/ink" xmlns:am3d="http://schemas.microsoft.com/office/drawing/2017/model3d" xmlns:o="urn:schemas-microsoft-com:office:office" xmlns:oel="http://schemas.microsoft.com/office/2019/extlst" xmlns:r="http://schemas.openxmlformats.org/officeDocument/2006/relationships" xmlns:m="http://schemas.openxmlformats.org/officeDocument/2006/math" xmlns:v="urn:schemas-microsoft-com:vml" xmlns:wp14="http://schemas.microsoft.com/office/word/2010/wordprocessingDrawing" xmlns:wp="http://schemas.openxmlformats.org/drawingml/2006/wordprocessingDrawing" xmlns:w10="urn:schemas-microsoft-com:office:word" xmlns:w="http://schemas.openxmlformats.org/wordprocessingml/2006/main" xmlns:w14="http://schemas.microsoft.com/office/word/2010/wordml" xmlns:w15="http://schemas.microsoft.com/office/word/2012/wordml" xmlns:w16cex="http://schemas.microsoft.com/office/word/2018/wordml/cex" xmlns:w16cid="http://schemas.microsoft.com/office/word/2016/wordml/cid" xmlns:w16="http://schemas.microsoft.com/office/word/2018/wordml" xmlns:w16du="http://schemas.microsoft.com/office/word/2023/wordml/word16du" xmlns:w16sdtdh="http://schemas.microsoft.com/office/word/2020/wordml/sdtdatahash" xmlns:w16sdtfl="http://schemas.microsoft.com/office/word/2024/wordml/sdtformatlock" xmlns:w16se="http://schemas.microsoft.com/office/word/2015/wordml/symex" xmlns:wpg="http://schemas.microsoft.com/office/word/2010/wordprocessingGroup" xmlns:wpi="http://schemas.microsoft.com/office/word/2010/wordprocessingInk" xmlns:wne="http://schemas.microsoft.com/office/word/2006/wordml" xmlns:wps="http://schemas.microsoft.com/office/word/2010/wordprocessingShape" mc:Ignorable="w14 w15 w16se w16cid w16 w16cex w16sdtdh w16sdtfl w16du wp14">
   <w:body>
     <w:p>
       <w:pPr>
@@ -32,7 +32,6 @@
     </w:p>
     <w:p>
       <w:pPr>
-        <w:spacing w:line="360" w:lineRule="auto"/>
         <w:rPr>
           <w:rFonts w:ascii="Arial" w:hAnsi="Arial" w:cs="Arial"/>
           <w:sz w:val="24"/>
@@ -132,8 +131,6 @@
     </w:p>
     <w:p>
       <w:pPr>
-        <w:spacing w:line="360" w:lineRule="auto"/>
-        <w:ind w:left="708"/>
         <w:rPr>
           <w:rFonts w:ascii="Arial" w:hAnsi="Arial" w:cs="Arial"/>
           <w:sz w:val="24"/>
@@ -151,8 +148,6 @@
       <w:r>
         <w:rPr>
           <w:rFonts w:ascii="Arial" w:hAnsi="Arial" w:cs="Arial"/>
-          <w:b/>
-          <w:bCs/>
           <w:sz w:val="24"/>
           <w:szCs w:val="24"/>
         </w:rPr>
@@ -161,8 +156,6 @@
       <w:r>
         <w:rPr>
           <w:rFonts w:ascii="Arial" w:hAnsi="Arial" w:cs="Arial"/>
-          <w:b/>
-          <w:bCs/>
           <w:sz w:val="24"/>
           <w:szCs w:val="24"/>
         </w:rPr>
@@ -171,8 +164,6 @@
       <w:r>
         <w:rPr>
           <w:rFonts w:ascii="Arial" w:hAnsi="Arial" w:cs="Arial"/>
-          <w:b/>
-          <w:bCs/>
           <w:sz w:val="24"/>
           <w:szCs w:val="24"/>
         </w:rPr>
@@ -204,8 +195,9 @@
           <w:sz w:val="24"/>
           <w:szCs w:val="24"/>
         </w:rPr>
-        <w:t>Etiam interdum diam eu tellus faucibus consectetur.</w:t>
-      </w:r>
+        <w:t xml:space="preserve">Etiam interdum diam eu tellus faucibus </w:t>
+      </w:r>
+      <w:proofErr w:type="gramStart"/>
       <w:r>
         <w:rPr>
           <w:rFonts w:ascii="Arial" w:hAnsi="Arial" w:cs="Arial"/>
@@ -214,8 +206,19 @@
           <w:sz w:val="24"/>
           <w:szCs w:val="24"/>
         </w:rPr>
+        <w:t>consectetur.</w:t>
+      </w:r>
+      <w:r>
+        <w:rPr>
+          <w:rFonts w:ascii="Arial" w:hAnsi="Arial" w:cs="Arial"/>
+          <w:i/>
+          <w:iCs/>
+          <w:sz w:val="24"/>
+          <w:szCs w:val="24"/>
+        </w:rPr>
         <w:t>*</w:t>
       </w:r>
+      <w:proofErr w:type="gramEnd"/>
       <w:r>
         <w:rPr>
           <w:rFonts w:ascii="Arial" w:hAnsi="Arial" w:cs="Arial"/>
@@ -236,8 +239,6 @@
       <w:r>
         <w:rPr>
           <w:rFonts w:ascii="Arial" w:hAnsi="Arial" w:cs="Arial"/>
-          <w:b/>
-          <w:bCs/>
           <w:sz w:val="24"/>
           <w:szCs w:val="24"/>
           <w:lang w:val="en-CA"/>
@@ -247,8 +248,6 @@
       <w:r>
         <w:rPr>
           <w:rFonts w:ascii="Arial" w:hAnsi="Arial" w:cs="Arial"/>
-          <w:b/>
-          <w:bCs/>
           <w:sz w:val="24"/>
           <w:szCs w:val="24"/>
           <w:lang w:val="en-CA"/>
@@ -258,8 +257,6 @@
       <w:r>
         <w:rPr>
           <w:rFonts w:ascii="Arial" w:hAnsi="Arial" w:cs="Arial"/>
-          <w:b/>
-          <w:bCs/>
           <w:sz w:val="24"/>
           <w:szCs w:val="24"/>
           <w:lang w:val="en-CA"/>
@@ -280,13 +277,67 @@
           <w:rFonts w:ascii="Arial" w:hAnsi="Arial" w:cs="Arial"/>
           <w:sz w:val="24"/>
           <w:szCs w:val="24"/>
-        </w:rPr>
-        <w:t>Donec ut enim non odio lacinia ultricies pharetra id felis. Vivamus bibendum vehicula ligula, et pulvinar felis luctus non.</w:t>
+          <w:lang w:val="it-IT"/>
+        </w:rPr>
+        <w:t xml:space="preserve">Donec ut enim non odio lacinia ultricies pharetra id felis. </w:t>
+      </w:r>
+      <w:proofErr w:type="spellStart"/>
+      <w:r>
+        <w:rPr>
+          <w:rFonts w:ascii="Arial" w:hAnsi="Arial" w:cs="Arial"/>
+          <w:sz w:val="24"/>
+          <w:szCs w:val="24"/>
+        </w:rPr>
+        <w:t>Vivamus</w:t>
+      </w:r>
+      <w:proofErr w:type="spellEnd"/>
+      <w:r>
+        <w:rPr>
+          <w:rFonts w:ascii="Arial" w:hAnsi="Arial" w:cs="Arial"/>
+          <w:sz w:val="24"/>
+          <w:szCs w:val="24"/>
+        </w:rPr>
+        <w:t xml:space="preserve"> bibendum </w:t>
+      </w:r>
+      <w:proofErr w:type="spellStart"/>
+      <w:r>
+        <w:rPr>
+          <w:rFonts w:ascii="Arial" w:hAnsi="Arial" w:cs="Arial"/>
+          <w:sz w:val="24"/>
+          <w:szCs w:val="24"/>
+        </w:rPr>
+        <w:t>vehicula</w:t>
+      </w:r>
+      <w:proofErr w:type="spellEnd"/>
+      <w:r>
+        <w:rPr>
+          <w:rFonts w:ascii="Arial" w:hAnsi="Arial" w:cs="Arial"/>
+          <w:sz w:val="24"/>
+          <w:szCs w:val="24"/>
+        </w:rPr>
+        <w:t xml:space="preserve"> </w:t>
+      </w:r>
+      <w:proofErr w:type="spellStart"/>
+      <w:r>
+        <w:rPr>
+          <w:rFonts w:ascii="Arial" w:hAnsi="Arial" w:cs="Arial"/>
+          <w:sz w:val="24"/>
+          <w:szCs w:val="24"/>
+        </w:rPr>
+        <w:t>ligula</w:t>
+      </w:r>
+      <w:proofErr w:type="spellEnd"/>
+      <w:r>
+        <w:rPr>
+          <w:rFonts w:ascii="Arial" w:hAnsi="Arial" w:cs="Arial"/>
+          <w:sz w:val="24"/>
+          <w:szCs w:val="24"/>
+        </w:rPr>
+        <w:t>, et pulvinar felis luctus non.</w:t>
       </w:r>
     </w:p>
     <w:p>
       <w:pPr>
-        <w:spacing w:line="360" w:lineRule="auto"/>
         <w:rPr>
           <w:rFonts w:ascii="Arial" w:hAnsi="Arial" w:cs="Arial"/>
           <w:sz w:val="24"/>
@@ -296,7 +347,6 @@
     </w:p>
     <w:p>
       <w:pPr>
-        <w:spacing w:line="360" w:lineRule="auto"/>
         <w:rPr>
           <w:rFonts w:ascii="Arial" w:hAnsi="Arial" w:cs="Arial"/>
           <w:sz w:val="24"/>
@@ -322,7 +372,6 @@
     </w:p>
     <w:p>
       <w:pPr>
-        <w:spacing w:line="360" w:lineRule="auto"/>
         <w:rPr>
           <w:rFonts w:ascii="Arial" w:hAnsi="Arial" w:cs="Arial"/>
           <w:sz w:val="24"/>
@@ -348,35 +397,28 @@
     </w:p>
     <w:p>
       <w:pPr>
-        <w:pStyle w:val="Paragraphedeliste"/>
-        <w:numPr>
-          <w:ilvl w:val="0"/>
-          <w:numId w:val="2"/>
-        </w:numPr>
-        <w:spacing w:line="360" w:lineRule="auto"/>
-        <w:rPr>
-          <w:rFonts w:ascii="Arial" w:hAnsi="Arial" w:cs="Arial"/>
-          <w:sz w:val="24"/>
-          <w:szCs w:val="24"/>
-        </w:rPr>
-      </w:pPr>
-      <w:proofErr w:type="spellStart"/>
-      <w:r>
-        <w:rPr>
-          <w:rFonts w:ascii="Arial" w:hAnsi="Arial" w:cs="Arial"/>
-          <w:sz w:val="24"/>
-          <w:szCs w:val="24"/>
-        </w:rPr>
-        <w:t>Mauris</w:t>
-      </w:r>
-      <w:proofErr w:type="spellEnd"/>
-      <w:r>
-        <w:rPr>
-          <w:rFonts w:ascii="Arial" w:hAnsi="Arial" w:cs="Arial"/>
-          <w:sz w:val="24"/>
-          <w:szCs w:val="24"/>
-        </w:rPr>
-        <w:t xml:space="preserve"> massa </w:t>
+        <w:ind w:left="360"/>
+        <w:rPr>
+          <w:rFonts w:ascii="Arial" w:hAnsi="Arial" w:cs="Arial"/>
+          <w:sz w:val="24"/>
+          <w:szCs w:val="24"/>
+        </w:rPr>
+      </w:pPr>
+      <w:r>
+        <w:rPr>
+          <w:rFonts w:ascii="Arial" w:hAnsi="Arial" w:cs="Arial"/>
+          <w:sz w:val="24"/>
+          <w:szCs w:val="24"/>
+        </w:rPr>
+        <w:t>1</w:t>
+      </w:r>
+      <w:r>
+        <w:rPr>
+          <w:rFonts w:ascii="Arial" w:hAnsi="Arial" w:cs="Arial"/>
+          <w:sz w:val="24"/>
+          <w:szCs w:val="24"/>
+        </w:rPr>
+        <w:t xml:space="preserve">Mauris massa </w:t>
       </w:r>
       <w:proofErr w:type="spellStart"/>
       <w:r>
@@ -399,19 +441,23 @@
     </w:p>
     <w:p>
       <w:pPr>
-        <w:pStyle w:val="Paragraphedeliste"/>
-        <w:numPr>
-          <w:ilvl w:val="0"/>
-          <w:numId w:val="2"/>
-        </w:numPr>
-        <w:spacing w:line="360" w:lineRule="auto"/>
-        <w:rPr>
-          <w:rFonts w:ascii="Arial" w:hAnsi="Arial" w:cs="Arial"/>
-          <w:sz w:val="24"/>
-          <w:szCs w:val="24"/>
-          <w:lang w:val="en-CA"/>
-        </w:rPr>
-      </w:pPr>
+        <w:ind w:left="360"/>
+        <w:rPr>
+          <w:rFonts w:ascii="Arial" w:hAnsi="Arial" w:cs="Arial"/>
+          <w:sz w:val="24"/>
+          <w:szCs w:val="24"/>
+          <w:lang w:val="en-CA"/>
+        </w:rPr>
+      </w:pPr>
+      <w:r>
+        <w:rPr>
+          <w:rFonts w:ascii="Arial" w:hAnsi="Arial" w:cs="Arial"/>
+          <w:sz w:val="24"/>
+          <w:szCs w:val="24"/>
+          <w:lang w:val="en-US"/>
+        </w:rPr>
+        <w:t>2</w:t>
+      </w:r>
       <w:r>
         <w:rPr>
           <w:rFonts w:ascii="Arial" w:hAnsi="Arial" w:cs="Arial"/>
@@ -479,40 +525,53 @@
           <w:szCs w:val="24"/>
           <w:lang w:val="en-CA"/>
         </w:rPr>
-        <w:t xml:space="preserve"> erat pharetra tincidunt. </w:t>
+        <w:t xml:space="preserve"> </w:t>
+      </w:r>
+      <w:proofErr w:type="spellStart"/>
+      <w:r>
+        <w:rPr>
+          <w:rFonts w:ascii="Arial" w:hAnsi="Arial" w:cs="Arial"/>
+          <w:sz w:val="24"/>
+          <w:szCs w:val="24"/>
+          <w:lang w:val="en-CA"/>
+        </w:rPr>
+        <w:t>erat</w:t>
+      </w:r>
+      <w:proofErr w:type="spellEnd"/>
+      <w:r>
+        <w:rPr>
+          <w:rFonts w:ascii="Arial" w:hAnsi="Arial" w:cs="Arial"/>
+          <w:sz w:val="24"/>
+          <w:szCs w:val="24"/>
+          <w:lang w:val="en-CA"/>
+        </w:rPr>
+        <w:t xml:space="preserve"> pharetra tincidunt. </w:t>
       </w:r>
     </w:p>
     <w:p>
       <w:pPr>
-        <w:pStyle w:val="Paragraphedeliste"/>
-        <w:numPr>
-          <w:ilvl w:val="0"/>
-          <w:numId w:val="2"/>
-        </w:numPr>
-        <w:spacing w:line="360" w:lineRule="auto"/>
-        <w:rPr>
-          <w:rFonts w:ascii="Arial" w:hAnsi="Arial" w:cs="Arial"/>
-          <w:sz w:val="24"/>
-          <w:szCs w:val="24"/>
-        </w:rPr>
-      </w:pPr>
-      <w:proofErr w:type="spellStart"/>
-      <w:r>
-        <w:rPr>
-          <w:rFonts w:ascii="Arial" w:hAnsi="Arial" w:cs="Arial"/>
-          <w:sz w:val="24"/>
-          <w:szCs w:val="24"/>
-        </w:rPr>
-        <w:t>Aenean</w:t>
-      </w:r>
-      <w:proofErr w:type="spellEnd"/>
-      <w:r>
-        <w:rPr>
-          <w:rFonts w:ascii="Arial" w:hAnsi="Arial" w:cs="Arial"/>
-          <w:sz w:val="24"/>
-          <w:szCs w:val="24"/>
-        </w:rPr>
-        <w:t xml:space="preserve"> </w:t>
+        <w:ind w:left="360"/>
+        <w:rPr>
+          <w:rFonts w:ascii="Arial" w:hAnsi="Arial" w:cs="Arial"/>
+          <w:sz w:val="24"/>
+          <w:szCs w:val="24"/>
+        </w:rPr>
+      </w:pPr>
+      <w:r>
+        <w:rPr>
+          <w:rFonts w:ascii="Arial" w:hAnsi="Arial" w:cs="Arial"/>
+          <w:sz w:val="24"/>
+          <w:szCs w:val="24"/>
+        </w:rPr>
+        <w:t>3</w:t>
+      </w:r>
+      <w:r>
+        <w:rPr>
+          <w:rFonts w:ascii="Arial" w:hAnsi="Arial" w:cs="Arial"/>
+          <w:sz w:val="24"/>
+          <w:szCs w:val="24"/>
+        </w:rPr>
+        <w:t xml:space="preserve">Aenean </w:t>
       </w:r>
       <w:proofErr w:type="spellStart"/>
       <w:r>
@@ -571,7 +630,6 @@
     </w:p>
     <w:p>
       <w:pPr>
-        <w:spacing w:line="360" w:lineRule="auto"/>
         <w:rPr>
           <w:rFonts w:ascii="Arial" w:hAnsi="Arial" w:cs="Arial"/>
           <w:sz w:val="24"/>
@@ -597,7 +655,6 @@
     </w:p>
     <w:p>
       <w:pPr>
-        <w:spacing w:line="360" w:lineRule="auto"/>
         <w:rPr>
           <w:rFonts w:ascii="Arial" w:hAnsi="Arial" w:cs="Arial"/>
           <w:sz w:val="24"/>
@@ -620,7 +677,6 @@
           <w:ilvl w:val="0"/>
           <w:numId w:val="3"/>
         </w:numPr>
-        <w:spacing w:line="360" w:lineRule="auto"/>
         <w:rPr>
           <w:rFonts w:ascii="Arial" w:hAnsi="Arial" w:cs="Arial"/>
           <w:sz w:val="24"/>
@@ -645,7 +701,6 @@
           <w:ilvl w:val="0"/>
           <w:numId w:val="3"/>
         </w:numPr>
-        <w:spacing w:line="360" w:lineRule="auto"/>
         <w:rPr>
           <w:rFonts w:ascii="Arial" w:hAnsi="Arial" w:cs="Arial"/>
           <w:sz w:val="24"/>
@@ -732,7 +787,6 @@
           <w:ilvl w:val="0"/>
           <w:numId w:val="3"/>
         </w:numPr>
-        <w:spacing w:line="360" w:lineRule="auto"/>
         <w:rPr>
           <w:rFonts w:ascii="Arial" w:hAnsi="Arial" w:cs="Arial"/>
           <w:sz w:val="24"/>
@@ -814,7 +868,6 @@
     </w:p>
     <w:p>
       <w:pPr>
-        <w:spacing w:line="360" w:lineRule="auto"/>
         <w:rPr>
           <w:rFonts w:ascii="Arial" w:hAnsi="Arial" w:cs="Arial"/>
           <w:sz w:val="24"/>
@@ -870,8 +923,6 @@
       <w:r>
         <w:rPr>
           <w:rFonts w:ascii="Arial" w:hAnsi="Arial" w:cs="Arial"/>
-          <w:b/>
-          <w:bCs/>
           <w:sz w:val="24"/>
           <w:szCs w:val="24"/>
         </w:rPr>
@@ -880,45 +931,48 @@
       <w:r>
         <w:rPr>
           <w:rFonts w:ascii="Arial" w:hAnsi="Arial" w:cs="Arial"/>
-          <w:b/>
-          <w:bCs/>
-          <w:sz w:val="24"/>
-          <w:szCs w:val="24"/>
-        </w:rPr>
-        <w:t>Ut varius arcu sit amet neque auctor suscipit.</w:t>
-      </w:r>
-      <w:r>
-        <w:rPr>
-          <w:rFonts w:ascii="Arial" w:hAnsi="Arial" w:cs="Arial"/>
-          <w:b/>
-          <w:bCs/>
-          <w:sz w:val="24"/>
-          <w:szCs w:val="24"/>
-        </w:rPr>
-        <w:t>**</w:t>
-      </w:r>
-      <w:r>
-        <w:rPr>
-          <w:rFonts w:ascii="Arial" w:hAnsi="Arial" w:cs="Arial"/>
-          <w:b/>
-          <w:bCs/>
-          <w:sz w:val="24"/>
-          <w:szCs w:val="24"/>
-        </w:rPr>
-        <w:t xml:space="preserve"> </w:t>
-      </w:r>
-      <w:r>
-        <w:rPr>
-          <w:rFonts w:ascii="Arial" w:hAnsi="Arial" w:cs="Arial"/>
-          <w:sz w:val="24"/>
-          <w:szCs w:val="24"/>
-        </w:rPr>
-        <w:t>Aliquam congue est molestie malesuada porta. Nulla ultrices congue mi, sit amet cursus ex interdum at. Nam ultrices, nulla eget semper feugiat, nisi libero efficitur orci, sit amet varius erat turpis eget augue.</w:t>
+          <w:sz w:val="24"/>
+          <w:szCs w:val="24"/>
+        </w:rPr>
+        <w:t xml:space="preserve">Ut varius arcu sit amet neque auctor </w:t>
+      </w:r>
+      <w:proofErr w:type="gramStart"/>
+      <w:r>
+        <w:rPr>
+          <w:rFonts w:ascii="Arial" w:hAnsi="Arial" w:cs="Arial"/>
+          <w:sz w:val="24"/>
+          <w:szCs w:val="24"/>
+        </w:rPr>
+        <w:t>suscipit.</w:t>
+      </w:r>
+      <w:r>
+        <w:rPr>
+          <w:rFonts w:ascii="Arial" w:hAnsi="Arial" w:cs="Arial"/>
+          <w:sz w:val="24"/>
+          <w:szCs w:val="24"/>
+        </w:rPr>
+        <w:t>*</w:t>
+      </w:r>
+      <w:proofErr w:type="gramEnd"/>
+      <w:r>
+        <w:rPr>
+          <w:rFonts w:ascii="Arial" w:hAnsi="Arial" w:cs="Arial"/>
+          <w:sz w:val="24"/>
+          <w:szCs w:val="24"/>
+        </w:rPr>
+        <w:t>*</w:t>
+      </w:r>
+      <w:r>
+        <w:rPr>
+          <w:rFonts w:ascii="Arial" w:hAnsi="Arial" w:cs="Arial"/>
+          <w:sz w:val="24"/>
+          <w:szCs w:val="24"/>
+        </w:rPr>
+        <w:t xml:space="preserve"> Aliquam congue est molestie malesuada porta. Nulla ultrices congue mi, sit amet cursus ex interdum at. Nam ultrices, nulla eget semper feugiat, nisi libero efficitur orci, sit amet varius erat turpis eget augue.</w:t>
       </w:r>
     </w:p>
     <w:p>
       <w:pPr>
-        <w:spacing w:line="360" w:lineRule="auto"/>
         <w:rPr>
           <w:rFonts w:ascii="Arial" w:hAnsi="Arial" w:cs="Arial"/>
           <w:sz w:val="24"/>
@@ -937,7 +991,7 @@
 </file>
 
 <file path=word/numbering.xml><?xml version="1.0" encoding="utf-8"?>
-<w:numbering xmlns:wpc="http://schemas.microsoft.com/office/word/2010/wordprocessingCanvas" xmlns:cx="http://schemas.microsoft.com/office/drawing/2014/chartex" xmlns:cx1="http://schemas.microsoft.com/office/drawing/2015/9/8/chartex" xmlns:cx2="http://schemas.microsoft.com/office/drawing/2015/10/21/chartex" xmlns:cx3="http://schemas.microsoft.com/office/drawing/2016/5/9/chartex" xmlns:cx4="http://schemas.microsoft.com/office/drawing/2016/5/10/chartex" xmlns:cx5="http://schemas.microsoft.com/office/drawing/2016/5/11/chartex" xmlns:cx6="http://schemas.microsoft.com/office/drawing/2016/5/12/chartex" xmlns:cx7="http://schemas.microsoft.com/office/drawing/2016/5/13/chartex" xmlns:cx8="http://schemas.microsoft.com/office/drawing/2016/5/14/chartex" xmlns:mc="http://schemas.openxmlformats.org/markup-compatibility/2006" xmlns:aink="http://schemas.microsoft.com/office/drawing/2016/ink" xmlns:am3d="http://schemas.microsoft.com/office/drawing/2017/model3d" xmlns:o="urn:schemas-microsoft-com:office:office" xmlns:oel="http://schemas.microsoft.com/office/2019/extlst" xmlns:r="http://schemas.openxmlformats.org/officeDocument/2006/relationships" xmlns:m="http://schemas.openxmlformats.org/officeDocument/2006/math" xmlns:v="urn:schemas-microsoft-com:vml" xmlns:wp14="http://schemas.microsoft.com/office/word/2010/wordprocessingDrawing" xmlns:wp="http://schemas.openxmlformats.org/drawingml/2006/wordprocessingDrawing" xmlns:w10="urn:schemas-microsoft-com:office:word" xmlns:w="http://schemas.openxmlformats.org/wordprocessingml/2006/main" xmlns:w14="http://schemas.microsoft.com/office/word/2010/wordml" xmlns:w15="http://schemas.microsoft.com/office/word/2012/wordml" xmlns:w16cex="http://schemas.microsoft.com/office/word/2018/wordml/cex" xmlns:w16cid="http://schemas.microsoft.com/office/word/2016/wordml/cid" xmlns:w16="http://schemas.microsoft.com/office/word/2018/wordml" xmlns:w16du="http://schemas.microsoft.com/office/word/2023/wordml/word16du" xmlns:w16sdtdh="http://schemas.microsoft.com/office/word/2020/wordml/sdtdatahash" xmlns:w16se="http://schemas.microsoft.com/office/word/2015/wordml/symex" xmlns:wpg="http://schemas.microsoft.com/office/word/2010/wordprocessingGroup" xmlns:wpi="http://schemas.microsoft.com/office/word/2010/wordprocessingInk" xmlns:wne="http://schemas.microsoft.com/office/word/2006/wordml" xmlns:wps="http://schemas.microsoft.com/office/word/2010/wordprocessingShape" mc:Ignorable="w14 w15 w16se w16cid w16 w16cex w16sdtdh w16du wp14">
+<w:numbering xmlns:wpc="http://schemas.microsoft.com/office/word/2010/wordprocessingCanvas" xmlns:cx="http://schemas.microsoft.com/office/drawing/2014/chartex" xmlns:cx1="http://schemas.microsoft.com/office/drawing/2015/9/8/chartex" xmlns:cx2="http://schemas.microsoft.com/office/drawing/2015/10/21/chartex" xmlns:cx3="http://schemas.microsoft.com/office/drawing/2016/5/9/chartex" xmlns:cx4="http://schemas.microsoft.com/office/drawing/2016/5/10/chartex" xmlns:cx5="http://schemas.microsoft.com/office/drawing/2016/5/11/chartex" xmlns:cx6="http://schemas.microsoft.com/office/drawing/2016/5/12/chartex" xmlns:cx7="http://schemas.microsoft.com/office/drawing/2016/5/13/chartex" xmlns:cx8="http://schemas.microsoft.com/office/drawing/2016/5/14/chartex" xmlns:mc="http://schemas.openxmlformats.org/markup-compatibility/2006" xmlns:aink="http://schemas.microsoft.com/office/drawing/2016/ink" xmlns:am3d="http://schemas.microsoft.com/office/drawing/2017/model3d" xmlns:o="urn:schemas-microsoft-com:office:office" xmlns:oel="http://schemas.microsoft.com/office/2019/extlst" xmlns:r="http://schemas.openxmlformats.org/officeDocument/2006/relationships" xmlns:m="http://schemas.openxmlformats.org/officeDocument/2006/math" xmlns:v="urn:schemas-microsoft-com:vml" xmlns:wp14="http://schemas.microsoft.com/office/word/2010/wordprocessingDrawing" xmlns:wp="http://schemas.openxmlformats.org/drawingml/2006/wordprocessingDrawing" xmlns:w10="urn:schemas-microsoft-com:office:word" xmlns:w="http://schemas.openxmlformats.org/wordprocessingml/2006/main" xmlns:w14="http://schemas.microsoft.com/office/word/2010/wordml" xmlns:w15="http://schemas.microsoft.com/office/word/2012/wordml" xmlns:w16cex="http://schemas.microsoft.com/office/word/2018/wordml/cex" xmlns:w16cid="http://schemas.microsoft.com/office/word/2016/wordml/cid" xmlns:w16="http://schemas.microsoft.com/office/word/2018/wordml" xmlns:w16du="http://schemas.microsoft.com/office/word/2023/wordml/word16du" xmlns:w16sdtdh="http://schemas.microsoft.com/office/word/2020/wordml/sdtdatahash" xmlns:w16sdtfl="http://schemas.microsoft.com/office/word/2024/wordml/sdtformatlock" xmlns:w16se="http://schemas.microsoft.com/office/word/2015/wordml/symex" xmlns:wpg="http://schemas.microsoft.com/office/word/2010/wordprocessingGroup" xmlns:wpi="http://schemas.microsoft.com/office/word/2010/wordprocessingInk" xmlns:wne="http://schemas.microsoft.com/office/word/2006/wordml" xmlns:wps="http://schemas.microsoft.com/office/word/2010/wordprocessingShape" mc:Ignorable="w14 w15 w16se w16cid w16 w16cex w16sdtdh w16sdtfl w16du wp14">
   <w:abstractNum w:abstractNumId="0" w15:restartNumberingAfterBreak="0">
     <w:nsid w:val="03F51092"/>
     <w:multiLevelType w:val="hybridMultilevel"/>
@@ -1354,7 +1408,7 @@
 </file>
 
 <file path=word/styles.xml><?xml version="1.0" encoding="utf-8"?>
-<w:styles xmlns:mc="http://schemas.openxmlformats.org/markup-compatibility/2006" xmlns:r="http://schemas.openxmlformats.org/officeDocument/2006/relationships" xmlns:w="http://schemas.openxmlformats.org/wordprocessingml/2006/main" xmlns:w14="http://schemas.microsoft.com/office/word/2010/wordml" xmlns:w15="http://schemas.microsoft.com/office/word/2012/wordml" xmlns:w16cex="http://schemas.microsoft.com/office/word/2018/wordml/cex" xmlns:w16cid="http://schemas.microsoft.com/office/word/2016/wordml/cid" xmlns:w16="http://schemas.microsoft.com/office/word/2018/wordml" xmlns:w16du="http://schemas.microsoft.com/office/word/2023/wordml/word16du" xmlns:w16sdtdh="http://schemas.microsoft.com/office/word/2020/wordml/sdtdatahash" xmlns:w16se="http://schemas.microsoft.com/office/word/2015/wordml/symex" mc:Ignorable="w14 w15 w16se w16cid w16 w16cex w16sdtdh w16du">
+<w:styles xmlns:mc="http://schemas.openxmlformats.org/markup-compatibility/2006" xmlns:r="http://schemas.openxmlformats.org/officeDocument/2006/relationships" xmlns:w="http://schemas.openxmlformats.org/wordprocessingml/2006/main" xmlns:w14="http://schemas.microsoft.com/office/word/2010/wordml" xmlns:w15="http://schemas.microsoft.com/office/word/2012/wordml" xmlns:w16cex="http://schemas.microsoft.com/office/word/2018/wordml/cex" xmlns:w16cid="http://schemas.microsoft.com/office/word/2016/wordml/cid" xmlns:w16="http://schemas.microsoft.com/office/word/2018/wordml" xmlns:w16du="http://schemas.microsoft.com/office/word/2023/wordml/word16du" xmlns:w16sdtdh="http://schemas.microsoft.com/office/word/2020/wordml/sdtdatahash" xmlns:w16sdtfl="http://schemas.microsoft.com/office/word/2024/wordml/sdtformatlock" xmlns:w16se="http://schemas.microsoft.com/office/word/2015/wordml/symex" mc:Ignorable="w14 w15 w16se w16cid w16 w16cex w16sdtdh w16sdtfl w16du">
   <w:docDefaults>
     <w:rPrDefault>
       <w:rPr>

</xml_diff>